<commit_message>
Add Monitor & Processed Documents to Module 07; rewrite Module 06 DU Framework; expand sidebar sub-navigation across all modules; rename DU Framework and Important Topics
Co-Authored-By: Claude Sonnet 4.6 <noreply@anthropic.com>
</commit_message>
<xml_diff>
--- a/IXP Training Course structure.docx
+++ b/IXP Training Course structure.docx
@@ -200,13 +200,8 @@
         </w:tabs>
         <w:ind w:left="1440"/>
       </w:pPr>
-      <w:proofErr w:type="spellStart"/>
-      <w:r>
-        <w:t>Uipath</w:t>
-      </w:r>
-      <w:proofErr w:type="spellEnd"/>
-      <w:r>
-        <w:t xml:space="preserve"> document understanding overview</w:t>
+      <w:r>
+        <w:t>Uipath document understanding overview</w:t>
       </w:r>
     </w:p>
     <w:p>
@@ -342,7 +337,15 @@
         <w:t>Exercise 1 – Extracting Data from Structured docs</w:t>
       </w:r>
       <w:r>
-        <w:t xml:space="preserve"> (Forms 1040X – Form template ( 5 fields only and 1 table) and Vehicle damage report – Regex) </w:t>
+        <w:t xml:space="preserve"> (Forms 1040X – Form template </w:t>
+      </w:r>
+      <w:proofErr w:type="gramStart"/>
+      <w:r>
+        <w:t>( 5</w:t>
+      </w:r>
+      <w:proofErr w:type="gramEnd"/>
+      <w:r>
+        <w:t xml:space="preserve"> fields only and 1 table) and Vehicle damage report – Regex) </w:t>
       </w:r>
       <w:r>
         <w:rPr>
@@ -721,7 +724,15 @@
         </w:numPr>
       </w:pPr>
       <w:r>
-        <w:t>Model Building ( Build )</w:t>
+        <w:t xml:space="preserve">Model Building </w:t>
+      </w:r>
+      <w:proofErr w:type="gramStart"/>
+      <w:r>
+        <w:t>( Build</w:t>
+      </w:r>
+      <w:proofErr w:type="gramEnd"/>
+      <w:r>
+        <w:t xml:space="preserve"> )</w:t>
       </w:r>
     </w:p>
     <w:p>
@@ -781,7 +792,15 @@
         </w:numPr>
       </w:pPr>
       <w:r>
-        <w:t>Model Validation ( Measure )</w:t>
+        <w:t xml:space="preserve">Model Validation </w:t>
+      </w:r>
+      <w:proofErr w:type="gramStart"/>
+      <w:r>
+        <w:t>( Measure</w:t>
+      </w:r>
+      <w:proofErr w:type="gramEnd"/>
+      <w:r>
+        <w:t xml:space="preserve"> )</w:t>
       </w:r>
     </w:p>
     <w:p>
@@ -793,7 +812,15 @@
         </w:numPr>
       </w:pPr>
       <w:r>
-        <w:t>Model deployment ( Publish )</w:t>
+        <w:t xml:space="preserve">Model deployment </w:t>
+      </w:r>
+      <w:proofErr w:type="gramStart"/>
+      <w:r>
+        <w:t>( Publish</w:t>
+      </w:r>
+      <w:proofErr w:type="gramEnd"/>
+      <w:r>
+        <w:t xml:space="preserve"> )</w:t>
       </w:r>
     </w:p>
     <w:p>
@@ -868,7 +895,39 @@
           <w:b/>
           <w:bCs/>
         </w:rPr>
-        <w:t xml:space="preserve"> and complex documents ( DU Framework ) – Attended robot</w:t>
+        <w:t xml:space="preserve"> and complex documents </w:t>
+      </w:r>
+      <w:proofErr w:type="gramStart"/>
+      <w:r>
+        <w:rPr>
+          <w:b/>
+          <w:bCs/>
+        </w:rPr>
+        <w:t>( DU</w:t>
+      </w:r>
+      <w:proofErr w:type="gramEnd"/>
+      <w:r>
+        <w:rPr>
+          <w:b/>
+          <w:bCs/>
+        </w:rPr>
+        <w:t xml:space="preserve"> </w:t>
+      </w:r>
+      <w:proofErr w:type="gramStart"/>
+      <w:r>
+        <w:rPr>
+          <w:b/>
+          <w:bCs/>
+        </w:rPr>
+        <w:t>Framework )</w:t>
+      </w:r>
+      <w:proofErr w:type="gramEnd"/>
+      <w:r>
+        <w:rPr>
+          <w:b/>
+          <w:bCs/>
+        </w:rPr>
+        <w:t xml:space="preserve"> – Attended robot</w:t>
       </w:r>
       <w:r>
         <w:rPr>
@@ -897,7 +956,39 @@
           <w:i/>
           <w:iCs/>
         </w:rPr>
-        <w:t xml:space="preserve"> ( only theory ) </w:t>
+        <w:t xml:space="preserve"> </w:t>
+      </w:r>
+      <w:proofErr w:type="gramStart"/>
+      <w:r>
+        <w:rPr>
+          <w:i/>
+          <w:iCs/>
+        </w:rPr>
+        <w:t>( only</w:t>
+      </w:r>
+      <w:proofErr w:type="gramEnd"/>
+      <w:r>
+        <w:rPr>
+          <w:i/>
+          <w:iCs/>
+        </w:rPr>
+        <w:t xml:space="preserve"> </w:t>
+      </w:r>
+      <w:proofErr w:type="gramStart"/>
+      <w:r>
+        <w:rPr>
+          <w:i/>
+          <w:iCs/>
+        </w:rPr>
+        <w:t>theory )</w:t>
+      </w:r>
+      <w:proofErr w:type="gramEnd"/>
+      <w:r>
+        <w:rPr>
+          <w:i/>
+          <w:iCs/>
+        </w:rPr>
+        <w:t xml:space="preserve"> </w:t>
       </w:r>
       <w:r>
         <w:rPr>
@@ -1370,8 +1461,13 @@
         </w:numPr>
       </w:pPr>
       <w:r>
-        <w:t>Introduction (Supported doc types, taxonomy, field group, fields, )</w:t>
-      </w:r>
+        <w:t>Introduction (Supported doc types, taxonomy, field group, fields</w:t>
+      </w:r>
+      <w:proofErr w:type="gramStart"/>
+      <w:r>
+        <w:t>, )</w:t>
+      </w:r>
+      <w:proofErr w:type="gramEnd"/>
     </w:p>
     <w:p>
       <w:pPr>
@@ -1410,7 +1506,15 @@
         </w:numPr>
       </w:pPr>
       <w:r>
-        <w:t>Model Building ( Build )</w:t>
+        <w:t xml:space="preserve">Model Building </w:t>
+      </w:r>
+      <w:proofErr w:type="gramStart"/>
+      <w:r>
+        <w:t>( Build</w:t>
+      </w:r>
+      <w:proofErr w:type="gramEnd"/>
+      <w:r>
+        <w:t xml:space="preserve"> )</w:t>
       </w:r>
     </w:p>
     <w:p>
@@ -1471,7 +1575,15 @@
         </w:numPr>
       </w:pPr>
       <w:r>
-        <w:t>Model Validation ( Measure )</w:t>
+        <w:t xml:space="preserve">Model Validation </w:t>
+      </w:r>
+      <w:proofErr w:type="gramStart"/>
+      <w:r>
+        <w:t>( Measure</w:t>
+      </w:r>
+      <w:proofErr w:type="gramEnd"/>
+      <w:r>
+        <w:t xml:space="preserve"> )</w:t>
       </w:r>
     </w:p>
     <w:p>
@@ -1483,7 +1595,15 @@
         </w:numPr>
       </w:pPr>
       <w:r>
-        <w:t>Model deployment ( Publish )</w:t>
+        <w:t xml:space="preserve">Model deployment </w:t>
+      </w:r>
+      <w:proofErr w:type="gramStart"/>
+      <w:r>
+        <w:t>( Publish</w:t>
+      </w:r>
+      <w:proofErr w:type="gramEnd"/>
+      <w:r>
+        <w:t xml:space="preserve"> )</w:t>
       </w:r>
     </w:p>
     <w:p>
@@ -1555,8 +1675,21 @@
         </w:numPr>
       </w:pPr>
       <w:r>
-        <w:t>Consume the project of IXP ( complex docs )</w:t>
-      </w:r>
+        <w:t xml:space="preserve">Consume the project of IXP </w:t>
+      </w:r>
+      <w:proofErr w:type="gramStart"/>
+      <w:r>
+        <w:t>( complex</w:t>
+      </w:r>
+      <w:proofErr w:type="gramEnd"/>
+      <w:r>
+        <w:t xml:space="preserve"> </w:t>
+      </w:r>
+      <w:proofErr w:type="gramStart"/>
+      <w:r>
+        <w:t>docs )</w:t>
+      </w:r>
+      <w:proofErr w:type="gramEnd"/>
     </w:p>
     <w:p>
       <w:pPr>
@@ -1600,7 +1733,39 @@
           <w:b/>
           <w:bCs/>
         </w:rPr>
-        <w:t xml:space="preserve"> structured and complex documents ( DU Framework ) – Attended robot.</w:t>
+        <w:t xml:space="preserve"> structured and complex documents </w:t>
+      </w:r>
+      <w:proofErr w:type="gramStart"/>
+      <w:r>
+        <w:rPr>
+          <w:b/>
+          <w:bCs/>
+        </w:rPr>
+        <w:t>( DU</w:t>
+      </w:r>
+      <w:proofErr w:type="gramEnd"/>
+      <w:r>
+        <w:rPr>
+          <w:b/>
+          <w:bCs/>
+        </w:rPr>
+        <w:t xml:space="preserve"> </w:t>
+      </w:r>
+      <w:proofErr w:type="gramStart"/>
+      <w:r>
+        <w:rPr>
+          <w:b/>
+          <w:bCs/>
+        </w:rPr>
+        <w:t>Framework )</w:t>
+      </w:r>
+      <w:proofErr w:type="gramEnd"/>
+      <w:r>
+        <w:rPr>
+          <w:b/>
+          <w:bCs/>
+        </w:rPr>
+        <w:t xml:space="preserve"> – Attended robot.</w:t>
       </w:r>
       <w:r>
         <w:rPr>
@@ -1756,6 +1921,337 @@
       </w:pPr>
       <w:r>
         <w:t>DU Use case example</w:t>
+      </w:r>
+    </w:p>
+    <w:p/>
+    <w:p>
+      <w:proofErr w:type="gramStart"/>
+      <w:r>
+        <w:t>Notes :</w:t>
+      </w:r>
+      <w:proofErr w:type="gramEnd"/>
+      <w:r>
+        <w:t xml:space="preserve"> </w:t>
+      </w:r>
+    </w:p>
+    <w:p/>
+    <w:p>
+      <w:proofErr w:type="gramStart"/>
+      <w:r>
+        <w:t xml:space="preserve">Introductory </w:t>
+      </w:r>
+      <w:r>
+        <w:t xml:space="preserve"> Page</w:t>
+      </w:r>
+      <w:proofErr w:type="gramEnd"/>
+      <w:r>
+        <w:t xml:space="preserve"> </w:t>
+      </w:r>
+      <w:r>
+        <w:t xml:space="preserve">– Make clear </w:t>
+      </w:r>
+      <w:r>
+        <w:t xml:space="preserve">what’s before the training and what’s during the training. </w:t>
+      </w:r>
+      <w:r>
+        <w:br/>
+      </w:r>
+      <w:r>
+        <w:br/>
+      </w:r>
+    </w:p>
+    <w:p>
+      <w:proofErr w:type="gramStart"/>
+      <w:r>
+        <w:t>Module :</w:t>
+      </w:r>
+      <w:proofErr w:type="gramEnd"/>
+      <w:r>
+        <w:t xml:space="preserve"> - 01 – Video </w:t>
+      </w:r>
+      <w:r>
+        <w:t>explaining the topics</w:t>
+      </w:r>
+      <w:r>
+        <w:t xml:space="preserve"> – Sergey</w:t>
+      </w:r>
+      <w:proofErr w:type="gramStart"/>
+      <w:r>
+        <w:t xml:space="preserve"> ..</w:t>
+      </w:r>
+      <w:proofErr w:type="gramEnd"/>
+      <w:r>
+        <w:t xml:space="preserve"> says</w:t>
+      </w:r>
+      <w:proofErr w:type="gramStart"/>
+      <w:r>
+        <w:t xml:space="preserve"> ..</w:t>
+      </w:r>
+      <w:proofErr w:type="gramEnd"/>
+      <w:r>
+        <w:t xml:space="preserve"> leave it … </w:t>
+      </w:r>
+    </w:p>
+    <w:p>
+      <w:r>
+        <w:t xml:space="preserve">Steps in forms of </w:t>
+      </w:r>
+      <w:proofErr w:type="gramStart"/>
+      <w:r>
+        <w:t xml:space="preserve">slides </w:t>
+      </w:r>
+      <w:r>
+        <w:t xml:space="preserve"> -</w:t>
+      </w:r>
+      <w:proofErr w:type="gramEnd"/>
+      <w:r>
+        <w:t xml:space="preserve"> </w:t>
+      </w:r>
+    </w:p>
+    <w:p>
+      <w:r>
+        <w:lastRenderedPageBreak/>
+        <w:t xml:space="preserve">Add a certificate </w:t>
+      </w:r>
+    </w:p>
+    <w:p>
+      <w:pPr>
+        <w:rPr>
+          <w:b/>
+          <w:bCs/>
+        </w:rPr>
+      </w:pPr>
+      <w:r>
+        <w:t xml:space="preserve">For module 04 – add subheadings in </w:t>
+      </w:r>
+      <w:proofErr w:type="gramStart"/>
+      <w:r>
+        <w:t>left .</w:t>
+      </w:r>
+      <w:proofErr w:type="gramEnd"/>
+      <w:r>
+        <w:t xml:space="preserve"> </w:t>
+      </w:r>
+      <w:r>
+        <w:br/>
+      </w:r>
+      <w:r>
+        <w:br/>
+        <w:t xml:space="preserve">In module </w:t>
+      </w:r>
+      <w:proofErr w:type="gramStart"/>
+      <w:r>
+        <w:t xml:space="preserve">05 </w:t>
+      </w:r>
+      <w:r>
+        <w:t>,</w:t>
+      </w:r>
+      <w:proofErr w:type="gramEnd"/>
+      <w:r>
+        <w:t xml:space="preserve"> Part </w:t>
+      </w:r>
+      <w:proofErr w:type="gramStart"/>
+      <w:r>
+        <w:t>1 ,</w:t>
+      </w:r>
+      <w:proofErr w:type="gramEnd"/>
+      <w:r>
+        <w:t xml:space="preserve"> add </w:t>
+      </w:r>
+      <w:proofErr w:type="gramStart"/>
+      <w:r>
+        <w:t>sub heading</w:t>
+      </w:r>
+      <w:proofErr w:type="gramEnd"/>
+      <w:r>
+        <w:t xml:space="preserve"> </w:t>
+      </w:r>
+      <w:r>
+        <w:t>“</w:t>
+      </w:r>
+      <w:r>
+        <w:rPr>
+          <w:b/>
+          <w:bCs/>
+        </w:rPr>
+        <w:t>Generative Extractor — Good Practices</w:t>
+      </w:r>
+    </w:p>
+    <w:p>
+      <w:r>
+        <w:t>“</w:t>
+      </w:r>
+      <w:r>
+        <w:br/>
+      </w:r>
+      <w:r>
+        <w:br/>
+        <w:t xml:space="preserve">Try to add table for when to use Generative extractor and when IXP </w:t>
+      </w:r>
+    </w:p>
+    <w:p>
+      <w:r>
+        <w:t xml:space="preserve">Add some colour … or highlight some </w:t>
+      </w:r>
+      <w:r>
+        <w:t>values in below scenario</w:t>
+      </w:r>
+    </w:p>
+    <w:p/>
+    <w:p>
+      <w:r>
+        <w:drawing>
+          <wp:inline distT="0" distB="0" distL="0" distR="0" wp14:anchorId="5575140E" wp14:editId="3BD1EEDE">
+            <wp:extent cx="5731510" cy="4471035"/>
+            <wp:effectExtent l="0" t="0" r="2540" b="5715"/>
+            <wp:docPr id="437535465" name="Picture 1"/>
+            <wp:cNvGraphicFramePr>
+              <a:graphicFrameLocks xmlns:a="http://schemas.openxmlformats.org/drawingml/2006/main" noChangeAspect="1"/>
+            </wp:cNvGraphicFramePr>
+            <a:graphic xmlns:a="http://schemas.openxmlformats.org/drawingml/2006/main">
+              <a:graphicData uri="http://schemas.openxmlformats.org/drawingml/2006/picture">
+                <pic:pic xmlns:pic="http://schemas.openxmlformats.org/drawingml/2006/picture">
+                  <pic:nvPicPr>
+                    <pic:cNvPr id="437535465" name=""/>
+                    <pic:cNvPicPr/>
+                  </pic:nvPicPr>
+                  <pic:blipFill>
+                    <a:blip r:embed="rId5"/>
+                    <a:stretch>
+                      <a:fillRect/>
+                    </a:stretch>
+                  </pic:blipFill>
+                  <pic:spPr>
+                    <a:xfrm>
+                      <a:off x="0" y="0"/>
+                      <a:ext cx="5731510" cy="4471035"/>
+                    </a:xfrm>
+                    <a:prstGeom prst="rect">
+                      <a:avLst/>
+                    </a:prstGeom>
+                  </pic:spPr>
+                </pic:pic>
+              </a:graphicData>
+            </a:graphic>
+          </wp:inline>
+        </w:drawing>
+      </w:r>
+    </w:p>
+    <w:p/>
+    <w:p>
+      <w:r>
+        <w:t xml:space="preserve">DU Framework – Theory, screenshot, </w:t>
+      </w:r>
+      <w:r>
+        <w:t xml:space="preserve">steps, best practices, how to </w:t>
+      </w:r>
+      <w:proofErr w:type="gramStart"/>
+      <w:r>
+        <w:t>use .</w:t>
+      </w:r>
+      <w:proofErr w:type="gramEnd"/>
+      <w:r>
+        <w:t xml:space="preserve"> </w:t>
+      </w:r>
+      <w:r>
+        <w:br/>
+      </w:r>
+      <w:r>
+        <w:br/>
+      </w:r>
+      <w:r>
+        <w:t>Important Topics</w:t>
+      </w:r>
+      <w:r>
+        <w:t xml:space="preserve"> </w:t>
+      </w:r>
+      <w:r>
+        <w:t>–</w:t>
+      </w:r>
+      <w:r>
+        <w:t xml:space="preserve"> </w:t>
+      </w:r>
+    </w:p>
+    <w:p>
+      <w:pPr>
+        <w:rPr>
+          <w:b/>
+          <w:bCs/>
+        </w:rPr>
+      </w:pPr>
+      <w:r>
+        <w:rPr>
+          <w:b/>
+          <w:bCs/>
+        </w:rPr>
+        <w:t xml:space="preserve">Monitor </w:t>
+      </w:r>
+      <w:r>
+        <w:rPr>
+          <w:b/>
+          <w:bCs/>
+        </w:rPr>
+        <w:br/>
+        <w:t>Processed Documents</w:t>
+      </w:r>
+    </w:p>
+    <w:p>
+      <w:pPr>
+        <w:rPr>
+          <w:b/>
+          <w:bCs/>
+        </w:rPr>
+      </w:pPr>
+    </w:p>
+    <w:p>
+      <w:hyperlink r:id="rId6" w:history="1">
+        <w:r>
+          <w:rPr>
+            <w:rStyle w:val="Hyperlink"/>
+          </w:rPr>
+          <w:t>https://docs.uipath.com/document-understanding/automation-cloud/latest/user-guide/monitor</w:t>
+        </w:r>
+      </w:hyperlink>
+    </w:p>
+    <w:p/>
+    <w:p/>
+    <w:p>
+      <w:r>
+        <w:drawing>
+          <wp:inline distT="0" distB="0" distL="0" distR="0" wp14:anchorId="7044A09D" wp14:editId="6D37D2EE">
+            <wp:extent cx="5731510" cy="4907280"/>
+            <wp:effectExtent l="0" t="0" r="2540" b="7620"/>
+            <wp:docPr id="763488242" name="Picture 1"/>
+            <wp:cNvGraphicFramePr>
+              <a:graphicFrameLocks xmlns:a="http://schemas.openxmlformats.org/drawingml/2006/main" noChangeAspect="1"/>
+            </wp:cNvGraphicFramePr>
+            <a:graphic xmlns:a="http://schemas.openxmlformats.org/drawingml/2006/main">
+              <a:graphicData uri="http://schemas.openxmlformats.org/drawingml/2006/picture">
+                <pic:pic xmlns:pic="http://schemas.openxmlformats.org/drawingml/2006/picture">
+                  <pic:nvPicPr>
+                    <pic:cNvPr id="763488242" name=""/>
+                    <pic:cNvPicPr/>
+                  </pic:nvPicPr>
+                  <pic:blipFill>
+                    <a:blip r:embed="rId7"/>
+                    <a:stretch>
+                      <a:fillRect/>
+                    </a:stretch>
+                  </pic:blipFill>
+                  <pic:spPr>
+                    <a:xfrm>
+                      <a:off x="0" y="0"/>
+                      <a:ext cx="5731510" cy="4907280"/>
+                    </a:xfrm>
+                    <a:prstGeom prst="rect">
+                      <a:avLst/>
+                    </a:prstGeom>
+                  </pic:spPr>
+                </pic:pic>
+              </a:graphicData>
+            </a:graphic>
+          </wp:inline>
+        </w:drawing>
       </w:r>
     </w:p>
     <w:p>
@@ -3048,7 +3544,6 @@
     <w:next w:val="Normal"/>
     <w:link w:val="Heading2Char"/>
     <w:uiPriority w:val="9"/>
-    <w:semiHidden/>
     <w:unhideWhenUsed/>
     <w:qFormat/>
     <w:rsid w:val="00CA7E6F"/>
@@ -3223,7 +3718,6 @@
   <w:style w:type="character" w:default="1" w:styleId="DefaultParagraphFont">
     <w:name w:val="Default Paragraph Font"/>
     <w:uiPriority w:val="1"/>
-    <w:semiHidden/>
     <w:unhideWhenUsed/>
   </w:style>
   <w:style w:type="table" w:default="1" w:styleId="TableNormal">
@@ -3265,7 +3759,6 @@
     <w:basedOn w:val="DefaultParagraphFont"/>
     <w:link w:val="Heading2"/>
     <w:uiPriority w:val="9"/>
-    <w:semiHidden/>
     <w:rsid w:val="00CA7E6F"/>
     <w:rPr>
       <w:rFonts w:asciiTheme="majorHAnsi" w:eastAsiaTheme="majorEastAsia" w:hAnsiTheme="majorHAnsi" w:cstheme="majorBidi"/>
@@ -3535,6 +4028,29 @@
       <w:smallCaps/>
       <w:color w:val="0F4761" w:themeColor="accent1" w:themeShade="BF"/>
       <w:spacing w:val="5"/>
+    </w:rPr>
+  </w:style>
+  <w:style w:type="character" w:styleId="Hyperlink">
+    <w:name w:val="Hyperlink"/>
+    <w:basedOn w:val="DefaultParagraphFont"/>
+    <w:uiPriority w:val="99"/>
+    <w:unhideWhenUsed/>
+    <w:rsid w:val="00223B84"/>
+    <w:rPr>
+      <w:color w:val="467886" w:themeColor="hyperlink"/>
+      <w:u w:val="single"/>
+    </w:rPr>
+  </w:style>
+  <w:style w:type="character" w:styleId="UnresolvedMention">
+    <w:name w:val="Unresolved Mention"/>
+    <w:basedOn w:val="DefaultParagraphFont"/>
+    <w:uiPriority w:val="99"/>
+    <w:semiHidden/>
+    <w:unhideWhenUsed/>
+    <w:rsid w:val="00223B84"/>
+    <w:rPr>
+      <w:color w:val="605E5C"/>
+      <w:shd w:val="clear" w:color="auto" w:fill="E1DFDD"/>
     </w:rPr>
   </w:style>
 </w:styles>

</xml_diff>